<commit_message>
feat: add PDF score extractor and core application modules
</commit_message>
<xml_diff>
--- a/documents/Bang_Phan_Cong_Cong_Viec.docx
+++ b/documents/Bang_Phan_Cong_Cong_Viec.docx
@@ -5,44 +5,54 @@
     <w:p>
       <w:pPr>
         <w:pStyle w:val="Heading1"/>
-        <w:jc w:val="center"/>
+        <w:spacing w:before="0" w:after="80"/>
       </w:pPr>
       <w:r>
         <w:rPr>
-          <w:sz w:val="28"/>
+          <w:rFonts w:ascii="Calibri" w:hAnsi="Calibri"/>
+          <w:b/>
+          <w:color w:val="1E3A8A"/>
+          <w:sz w:val="32"/>
         </w:rPr>
         <w:t>BẢNG PHÂN CÔNG CÔNG VIỆC NHÓM</w:t>
       </w:r>
     </w:p>
     <w:p>
       <w:pPr>
-        <w:jc w:val="center"/>
+        <w:spacing w:before="0" w:after="240"/>
       </w:pPr>
       <w:r>
         <w:rPr>
+          <w:rFonts w:ascii="Calibri" w:hAnsi="Calibri"/>
           <w:i/>
-          <w:sz w:val="21"/>
+          <w:color w:val="64748B"/>
+          <w:sz w:val="22"/>
         </w:rPr>
         <w:t>Môn học: Hệ Trợ Giúp Quyết Định  |  Đề tài: DSS FIT-HAU</w:t>
       </w:r>
     </w:p>
-    <w:p/>
     <w:tbl>
       <w:tblPr>
-        <w:tblStyle w:val="TableGrid"/>
         <w:tblW w:type="auto" w:w="0"/>
+        <w:jc w:val="center"/>
         <w:tblLook w:firstColumn="1" w:firstRow="1" w:lastColumn="0" w:lastRow="0" w:noHBand="0" w:noVBand="1" w:val="04A0"/>
       </w:tblPr>
       <w:tblGrid>
-        <w:gridCol w:w="3213"/>
-        <w:gridCol w:w="3213"/>
-        <w:gridCol w:w="3213"/>
+        <w:gridCol w:w="3312"/>
+        <w:gridCol w:w="3312"/>
+        <w:gridCol w:w="3312"/>
       </w:tblGrid>
       <w:tr>
         <w:tc>
           <w:tcPr>
-            <w:tcW w:type="dxa" w:w="1984"/>
-            <w:shd w:val="clear" w:color="auto" w:fill="1E3A5F"/>
+            <w:tcW w:type="dxa" w:w="2160"/>
+            <w:shd w:fill="1E3A8A"/>
+            <w:tcMar>
+              <w:top w:w="100" w:type="dxa"/>
+              <w:bottom w:w="100" w:type="dxa"/>
+              <w:left w:w="100" w:type="dxa"/>
+              <w:right w:w="100" w:type="dxa"/>
+            </w:tcMar>
           </w:tcPr>
           <w:p>
             <w:pPr>
@@ -50,9 +60,10 @@
             </w:pPr>
             <w:r>
               <w:rPr>
+                <w:rFonts w:ascii="Calibri" w:hAnsi="Calibri"/>
                 <w:b/>
                 <w:color w:val="FFFFFF"/>
-                <w:sz w:val="22"/>
+                <w:sz w:val="21"/>
               </w:rPr>
               <w:t>Tên</w:t>
             </w:r>
@@ -60,8 +71,14 @@
         </w:tc>
         <w:tc>
           <w:tcPr>
-            <w:tcW w:type="dxa" w:w="1701"/>
-            <w:shd w:val="clear" w:color="auto" w:fill="1E3A5F"/>
+            <w:tcW w:type="dxa" w:w="1728"/>
+            <w:shd w:fill="1E3A8A"/>
+            <w:tcMar>
+              <w:top w:w="100" w:type="dxa"/>
+              <w:bottom w:w="100" w:type="dxa"/>
+              <w:left w:w="100" w:type="dxa"/>
+              <w:right w:w="100" w:type="dxa"/>
+            </w:tcMar>
           </w:tcPr>
           <w:p>
             <w:pPr>
@@ -69,9 +86,10 @@
             </w:pPr>
             <w:r>
               <w:rPr>
+                <w:rFonts w:ascii="Calibri" w:hAnsi="Calibri"/>
                 <w:b/>
                 <w:color w:val="FFFFFF"/>
-                <w:sz w:val="22"/>
+                <w:sz w:val="21"/>
               </w:rPr>
               <w:t>Mã sinh viên</w:t>
             </w:r>
@@ -79,8 +97,14 @@
         </w:tc>
         <w:tc>
           <w:tcPr>
-            <w:tcW w:type="dxa" w:w="5953"/>
-            <w:shd w:val="clear" w:color="auto" w:fill="1E3A5F"/>
+            <w:tcW w:type="dxa" w:w="6192"/>
+            <w:shd w:fill="1E3A8A"/>
+            <w:tcMar>
+              <w:top w:w="100" w:type="dxa"/>
+              <w:bottom w:w="100" w:type="dxa"/>
+              <w:left w:w="100" w:type="dxa"/>
+              <w:right w:w="100" w:type="dxa"/>
+            </w:tcMar>
           </w:tcPr>
           <w:p>
             <w:pPr>
@@ -88,9 +112,10 @@
             </w:pPr>
             <w:r>
               <w:rPr>
+                <w:rFonts w:ascii="Calibri" w:hAnsi="Calibri"/>
                 <w:b/>
                 <w:color w:val="FFFFFF"/>
-                <w:sz w:val="22"/>
+                <w:sz w:val="21"/>
               </w:rPr>
               <w:t>Phân công công việc</w:t>
             </w:r>
@@ -100,7 +125,37 @@
       <w:tr>
         <w:tc>
           <w:tcPr>
-            <w:tcW w:type="dxa" w:w="1984"/>
+            <w:tcW w:type="dxa" w:w="2160"/>
+            <w:shd w:fill="FFFFFF"/>
+            <w:tcMar>
+              <w:top w:w="80" w:type="dxa"/>
+              <w:bottom w:w="80" w:type="dxa"/>
+              <w:left w:w="100" w:type="dxa"/>
+              <w:right w:w="100" w:type="dxa"/>
+            </w:tcMar>
+          </w:tcPr>
+          <w:p>
+            <w:r>
+              <w:rPr>
+                <w:rFonts w:ascii="Calibri" w:hAnsi="Calibri"/>
+                <w:b/>
+                <w:color w:val="1E293B"/>
+                <w:sz w:val="21"/>
+              </w:rPr>
+              <w:t>Trần Xuân Bách (Nhóm trưởng)</w:t>
+            </w:r>
+          </w:p>
+        </w:tc>
+        <w:tc>
+          <w:tcPr>
+            <w:tcW w:type="dxa" w:w="1728"/>
+            <w:shd w:fill="FFFFFF"/>
+            <w:tcMar>
+              <w:top w:w="80" w:type="dxa"/>
+              <w:bottom w:w="80" w:type="dxa"/>
+              <w:left w:w="100" w:type="dxa"/>
+              <w:right w:w="100" w:type="dxa"/>
+            </w:tcMar>
           </w:tcPr>
           <w:p>
             <w:pPr>
@@ -108,26 +163,9 @@
             </w:pPr>
             <w:r>
               <w:rPr>
-                <w:b/>
-                <w:sz w:val="21"/>
-              </w:rPr>
-              <w:t>Trần Xuân Bách</w:t>
-              <w:br/>
-              <w:t>(Nhóm trưởng)</w:t>
-            </w:r>
-          </w:p>
-        </w:tc>
-        <w:tc>
-          <w:tcPr>
-            <w:tcW w:type="dxa" w:w="1701"/>
-          </w:tcPr>
-          <w:p>
-            <w:pPr>
-              <w:jc w:val="center"/>
-            </w:pPr>
-            <w:r>
-              <w:rPr>
-                <w:sz w:val="21"/>
+                <w:rFonts w:ascii="Calibri" w:hAnsi="Calibri"/>
+                <w:color w:val="475569"/>
+                <w:sz w:val="20"/>
               </w:rPr>
               <w:t>2355010022</w:t>
             </w:r>
@@ -135,86 +173,135 @@
         </w:tc>
         <w:tc>
           <w:tcPr>
-            <w:tcW w:type="dxa" w:w="5953"/>
+            <w:tcW w:type="dxa" w:w="6192"/>
+            <w:shd w:fill="FFFFFF"/>
+            <w:tcMar>
+              <w:top w:w="80" w:type="dxa"/>
+              <w:bottom w:w="80" w:type="dxa"/>
+              <w:left w:w="100" w:type="dxa"/>
+              <w:right w:w="100" w:type="dxa"/>
+            </w:tcMar>
           </w:tcPr>
           <w:p>
             <w:pPr>
-              <w:spacing w:before="20" w:after="20"/>
+              <w:spacing w:before="0" w:after="40" w:line="269" w:lineRule="auto"/>
             </w:pPr>
+            <w:r/>
             <w:r>
               <w:rPr>
+                <w:rFonts w:ascii="Calibri" w:hAnsi="Calibri"/>
                 <w:b/>
-                <w:i w:val="0"/>
+                <w:color w:val="1E3A8A"/>
                 <w:sz w:val="20"/>
               </w:rPr>
-              <w:t>Kiến trúc Hệ thống &amp; Mô hình AI:</w:t>
+              <w:t>Kiến trúc Hệ thống &amp; Thuật toán Lõi (Core AI Architect):</w:t>
             </w:r>
           </w:p>
           <w:p>
             <w:pPr>
-              <w:spacing w:before="20" w:after="20"/>
+              <w:spacing w:before="0" w:after="40" w:line="269" w:lineRule="auto"/>
             </w:pPr>
             <w:r>
               <w:rPr>
-                <w:b w:val="0"/>
-                <w:i w:val="0"/>
-                <w:sz w:val="20"/>
+                <w:rFonts w:ascii="Calibri" w:hAnsi="Calibri"/>
+                <w:color w:val="334155"/>
+                <w:sz w:val="19"/>
               </w:rPr>
-              <w:t>- app.py: Hàm explain_decision() — XAI (truy ngược decision_path,</w:t>
-              <w:br/>
-              <w:t xml:space="preserve">  xây dựng chuỗi giải thích tiếng Việt từng bước suy luận).</w:t>
+              <w:t>- data_pipeline.py: Xây dựng ma trận CAREER_PROFILES (5 chuyên ngành x 24 môn học theo chuẩn đầu ra Khoa CNTT - HAU).</w:t>
             </w:r>
           </w:p>
           <w:p>
             <w:pPr>
-              <w:spacing w:before="20" w:after="20"/>
+              <w:spacing w:before="0" w:after="40" w:line="269" w:lineRule="auto"/>
             </w:pPr>
             <w:r>
               <w:rPr>
-                <w:b w:val="0"/>
-                <w:i w:val="0"/>
-                <w:sz w:val="20"/>
+                <w:rFonts w:ascii="Calibri" w:hAnsi="Calibri"/>
+                <w:color w:val="334155"/>
+                <w:sz w:val="19"/>
               </w:rPr>
-              <w:t>- app.py: Khối dự đoán trong main() — gọi predict(), predict_proba(),</w:t>
-              <w:br/>
-              <w:t xml:space="preserve">  hiển thị kết quả + xác suất 5 ngành, bố cục Tab 1.</w:t>
+              <w:t>- data_pipeline.py: Lập trình thuật toán Cosine Similarity dạng đại số ma trận bằng NumPy Broadcasting np.dot(score_matrix, profile_matrix.T) và mở rộng chiều student_norms[:, np.newaxis], xử lý hằng số epsilon 1e-10 chống lỗi chia cho 0.</w:t>
             </w:r>
           </w:p>
           <w:p>
             <w:pPr>
-              <w:spacing w:before="20" w:after="20"/>
+              <w:spacing w:before="0" w:after="40" w:line="269" w:lineRule="auto"/>
             </w:pPr>
             <w:r>
               <w:rPr>
-                <w:b w:val="0"/>
-                <w:i w:val="0"/>
-                <w:sz w:val="20"/>
+                <w:rFonts w:ascii="Calibri" w:hAnsi="Calibri"/>
+                <w:color w:val="334155"/>
+                <w:sz w:val="19"/>
               </w:rPr>
-              <w:t>- train_core.py: Hàm train_model() — GridSearchCV (42 tổ hợp,</w:t>
-              <w:br/>
-              <w:t xml:space="preserve">  5-Fold CV) và run_training_pipeline() điều phối pipeline.</w:t>
+              <w:t>- data_pipeline.py: Hàm assign_labels() gán nhãn tự động cho 1.326 sinh viên trong 0.03s; hàm clean_data() (fillna -1.0) và hàm prepare_for_training() xuất file FIT_HAU_Cleaned.csv.</w:t>
             </w:r>
           </w:p>
           <w:p>
             <w:pPr>
-              <w:spacing w:before="20" w:after="20"/>
+              <w:spacing w:before="0" w:after="40" w:line="269" w:lineRule="auto"/>
             </w:pPr>
             <w:r>
               <w:rPr>
-                <w:b w:val="0"/>
-                <w:i w:val="0"/>
-                <w:sz w:val="20"/>
+                <w:rFonts w:ascii="Calibri" w:hAnsi="Calibri"/>
+                <w:color w:val="334155"/>
+                <w:sz w:val="19"/>
               </w:rPr>
+              <w:t>- train_core.py: Thiết kế chiến lược phân tầng dữ liệu train_test_split(test_size=0.2, stratify=y, random_state=42).</w:t>
             </w:r>
           </w:p>
           <w:p>
             <w:pPr>
-              <w:spacing w:before="20" w:after="20"/>
+              <w:spacing w:before="0" w:after="40" w:line="269" w:lineRule="auto"/>
             </w:pPr>
             <w:r>
               <w:rPr>
+                <w:rFonts w:ascii="Calibri" w:hAnsi="Calibri"/>
+                <w:color w:val="334155"/>
+                <w:sz w:val="19"/>
+              </w:rPr>
+              <w:t>- train_core.py: Cấu hình và chạy GridSearchCV tự động tối ưu hóa siêu tham số (42 tổ hợp x 5-Fold CV = 210 lượt train); hàm evaluate_model() đánh giá Accuracy (96.23%), Precision, Recall, F1-Score và ma trận nhầm lẫn Confusion Matrix.</w:t>
+            </w:r>
+          </w:p>
+          <w:p>
+            <w:pPr>
+              <w:spacing w:before="0" w:after="40" w:line="269" w:lineRule="auto"/>
+            </w:pPr>
+            <w:r>
+              <w:rPr>
+                <w:rFonts w:ascii="Calibri" w:hAnsi="Calibri"/>
+                <w:color w:val="334155"/>
+                <w:sz w:val="19"/>
+              </w:rPr>
+              <w:t>- train_core.py: Xuất sơ đồ Cây Quyết Định (tree_plot.png) và đóng gói mô hình nhị phân bằng Joblib vào models/dss_brain.pkl.</w:t>
+            </w:r>
+          </w:p>
+          <w:p>
+            <w:pPr>
+              <w:spacing w:before="0" w:after="40" w:line="269" w:lineRule="auto"/>
+            </w:pPr>
+            <w:r>
+              <w:rPr>
+                <w:rFonts w:ascii="Calibri" w:hAnsi="Calibri"/>
+                <w:color w:val="334155"/>
+                <w:sz w:val="19"/>
+              </w:rPr>
+              <w:t>- Code Review toàn bộ dự án và điều phối tích hợp hệ thống.</w:t>
+            </w:r>
+          </w:p>
+          <w:p>
+            <w:pPr>
+              <w:spacing w:before="0" w:after="40" w:line="269" w:lineRule="auto"/>
+            </w:pPr>
+          </w:p>
+          <w:p>
+            <w:pPr>
+              <w:spacing w:before="0" w:after="40" w:line="269" w:lineRule="auto"/>
+            </w:pPr>
+            <w:r>
+              <w:rPr>
+                <w:rFonts w:ascii="Calibri" w:hAnsi="Calibri"/>
                 <w:b/>
-                <w:i w:val="0"/>
+                <w:color w:val="0D9488"/>
                 <w:sz w:val="20"/>
               </w:rPr>
               <w:t>Báo cáo Word:</w:t>
@@ -222,53 +309,86 @@
           </w:p>
           <w:p>
             <w:pPr>
-              <w:spacing w:before="20" w:after="20"/>
+              <w:spacing w:before="0" w:after="40" w:line="269" w:lineRule="auto"/>
             </w:pPr>
             <w:r>
               <w:rPr>
-                <w:b w:val="0"/>
-                <w:i w:val="0"/>
-                <w:sz w:val="20"/>
+                <w:rFonts w:ascii="Calibri" w:hAnsi="Calibri"/>
+                <w:color w:val="334155"/>
+                <w:sz w:val="19"/>
               </w:rPr>
-              <w:t>Chương 2: Kiến trúc hệ thống Hybrid 2 tầng, sơ đồ luồng dữ liệu.</w:t>
+              <w:t>- Chương 3 (Phân tích &amp; Thiết kế Hệ thống): Thiết kế kiến trúc tổng thể Hybrid 3 tầng, vẽ sơ đồ luồng dữ liệu (Data Flow Diagram), đặc tả các Use Case hệ thống.</w:t>
             </w:r>
           </w:p>
           <w:p>
             <w:pPr>
-              <w:spacing w:before="20" w:after="20"/>
+              <w:spacing w:before="0" w:after="40" w:line="269" w:lineRule="auto"/>
             </w:pPr>
             <w:r>
               <w:rPr>
-                <w:b w:val="0"/>
-                <w:i w:val="0"/>
-                <w:sz w:val="20"/>
+                <w:rFonts w:ascii="Calibri" w:hAnsi="Calibri"/>
+                <w:color w:val="334155"/>
+                <w:sz w:val="19"/>
               </w:rPr>
-              <w:t>Chương 3: Decision Tree, GridSearchCV, XAI — giải thích code chi tiết.</w:t>
+              <w:t>- Phần Cơ sở Toán học &amp; Thuật toán: Chứng minh công thức Cosine Similarity so với khoảng cách Euclid; phân tích lý thuyết thông tin Shannon (Entropy, Information Gain) và cơ chế phân nhánh của Decision Tree.</w:t>
             </w:r>
           </w:p>
           <w:p>
             <w:pPr>
-              <w:spacing w:before="20" w:after="20"/>
+              <w:spacing w:before="0" w:after="40" w:line="269" w:lineRule="auto"/>
+            </w:pPr>
+          </w:p>
+          <w:p>
+            <w:pPr>
+              <w:spacing w:before="0" w:after="40" w:line="269" w:lineRule="auto"/>
             </w:pPr>
             <w:r>
               <w:rPr>
-                <w:b w:val="0"/>
-                <w:i w:val="0"/>
+                <w:rFonts w:ascii="Calibri" w:hAnsi="Calibri"/>
+                <w:b/>
+                <w:color w:val="B45309"/>
                 <w:sz w:val="20"/>
               </w:rPr>
+              <w:t>Canva / Slide Thuyết trình:</w:t>
             </w:r>
           </w:p>
           <w:p>
             <w:pPr>
-              <w:spacing w:before="20" w:after="20"/>
+              <w:spacing w:before="0" w:after="40" w:line="269" w:lineRule="auto"/>
             </w:pPr>
             <w:r>
               <w:rPr>
-                <w:b w:val="0"/>
-                <w:i w:val="0"/>
-                <w:sz w:val="20"/>
+                <w:rFonts w:ascii="Calibri" w:hAnsi="Calibri"/>
+                <w:color w:val="334155"/>
+                <w:sz w:val="19"/>
               </w:rPr>
-              <w:t>Canva: Slide kiến trúc tổng quan, demo XAI, đánh giá mô hình.</w:t>
+              <w:t>- Slide Kiến trúc tổng thể hệ thống (sơ đồ Hybrid 3 tầng).</w:t>
+            </w:r>
+          </w:p>
+          <w:p>
+            <w:pPr>
+              <w:spacing w:before="0" w:after="40" w:line="269" w:lineRule="auto"/>
+            </w:pPr>
+            <w:r>
+              <w:rPr>
+                <w:rFonts w:ascii="Calibri" w:hAnsi="Calibri"/>
+                <w:color w:val="334155"/>
+                <w:sz w:val="19"/>
+              </w:rPr>
+              <w:t>- Slide Cơ sở Toán học thuật toán (Cosine Similarity &amp; NumPy Broadcasting).</w:t>
+            </w:r>
+          </w:p>
+          <w:p>
+            <w:pPr>
+              <w:spacing w:before="0" w:after="40" w:line="269" w:lineRule="auto"/>
+            </w:pPr>
+            <w:r>
+              <w:rPr>
+                <w:rFonts w:ascii="Calibri" w:hAnsi="Calibri"/>
+                <w:color w:val="334155"/>
+                <w:sz w:val="19"/>
+              </w:rPr>
+              <w:t>- Slide Kết quả huấn luyện mô hình (Accuracy 96.23%, Confusion Matrix và Tree Plot).</w:t>
             </w:r>
           </w:p>
         </w:tc>
@@ -276,16 +396,21 @@
       <w:tr>
         <w:tc>
           <w:tcPr>
-            <w:tcW w:type="dxa" w:w="1984"/>
-            <w:shd w:val="clear" w:color="auto" w:fill="F1F5F9"/>
+            <w:tcW w:type="dxa" w:w="2160"/>
+            <w:shd w:fill="F8FAFC"/>
+            <w:tcMar>
+              <w:top w:w="80" w:type="dxa"/>
+              <w:bottom w:w="80" w:type="dxa"/>
+              <w:left w:w="100" w:type="dxa"/>
+              <w:right w:w="100" w:type="dxa"/>
+            </w:tcMar>
           </w:tcPr>
           <w:p>
-            <w:pPr>
-              <w:jc w:val="center"/>
-            </w:pPr>
             <w:r>
               <w:rPr>
+                <w:rFonts w:ascii="Calibri" w:hAnsi="Calibri"/>
                 <w:b/>
+                <w:color w:val="1E293B"/>
                 <w:sz w:val="21"/>
               </w:rPr>
               <w:t>Lưu Trường Giang</w:t>
@@ -294,8 +419,14 @@
         </w:tc>
         <w:tc>
           <w:tcPr>
-            <w:tcW w:type="dxa" w:w="1701"/>
-            <w:shd w:val="clear" w:color="auto" w:fill="F1F5F9"/>
+            <w:tcW w:type="dxa" w:w="1728"/>
+            <w:shd w:fill="F8FAFC"/>
+            <w:tcMar>
+              <w:top w:w="80" w:type="dxa"/>
+              <w:bottom w:w="80" w:type="dxa"/>
+              <w:left w:w="100" w:type="dxa"/>
+              <w:right w:w="100" w:type="dxa"/>
+            </w:tcMar>
           </w:tcPr>
           <w:p>
             <w:pPr>
@@ -303,7 +434,9 @@
             </w:pPr>
             <w:r>
               <w:rPr>
-                <w:sz w:val="21"/>
+                <w:rFonts w:ascii="Calibri" w:hAnsi="Calibri"/>
+                <w:color w:val="475569"/>
+                <w:sz w:val="20"/>
               </w:rPr>
               <w:t>2355010070</w:t>
             </w:r>
@@ -311,87 +444,109 @@
         </w:tc>
         <w:tc>
           <w:tcPr>
-            <w:tcW w:type="dxa" w:w="5953"/>
-            <w:shd w:val="clear" w:color="auto" w:fill="F1F5F9"/>
+            <w:tcW w:type="dxa" w:w="6192"/>
+            <w:shd w:fill="F8FAFC"/>
+            <w:tcMar>
+              <w:top w:w="80" w:type="dxa"/>
+              <w:bottom w:w="80" w:type="dxa"/>
+              <w:left w:w="100" w:type="dxa"/>
+              <w:right w:w="100" w:type="dxa"/>
+            </w:tcMar>
           </w:tcPr>
           <w:p>
             <w:pPr>
-              <w:spacing w:before="20" w:after="20"/>
+              <w:spacing w:before="0" w:after="40" w:line="269" w:lineRule="auto"/>
             </w:pPr>
+            <w:r/>
             <w:r>
               <w:rPr>
+                <w:rFonts w:ascii="Calibri" w:hAnsi="Calibri"/>
                 <w:b/>
-                <w:i w:val="0"/>
+                <w:color w:val="1E3A8A"/>
                 <w:sz w:val="20"/>
               </w:rPr>
-              <w:t>Thuật toán &amp; Đánh giá Mô hình:</w:t>
+              <w:t>Logic Nghiệp vụ Tầng 3, XAI &amp; Điều khiển Trạng thái (Logic &amp; XAI Developer):</w:t>
             </w:r>
           </w:p>
           <w:p>
             <w:pPr>
-              <w:spacing w:before="20" w:after="20"/>
+              <w:spacing w:before="0" w:after="40" w:line="269" w:lineRule="auto"/>
             </w:pPr>
             <w:r>
               <w:rPr>
-                <w:b w:val="0"/>
-                <w:i w:val="0"/>
-                <w:sz w:val="20"/>
+                <w:rFonts w:ascii="Calibri" w:hAnsi="Calibri"/>
+                <w:color w:val="334155"/>
+                <w:sz w:val="19"/>
               </w:rPr>
-              <w:t>- train_core.py: split_data() (80/20, stratify), evaluate_model()</w:t>
-              <w:br/>
-              <w:t xml:space="preserve">  (accuracy, classification_report, Confusion Matrix, plot_tree).</w:t>
+              <w:t>- app.py: Lập trình hàm calculate_hybrid_score() — Tầng 3 Hybrid Scoring: Lấy phân phối xác suất từ Decision Tree model.predict_proba(), cộng điểm thưởng sở thích PREFERENCE_BONUS = 0.10 cho các ngành sinh viên lựa chọn, tái chuẩn hóa tổng điểm về 100% và sắp xếp bảng xếp hạng Top 3.</w:t>
             </w:r>
           </w:p>
           <w:p>
             <w:pPr>
-              <w:spacing w:before="20" w:after="20"/>
+              <w:spacing w:before="0" w:after="40" w:line="269" w:lineRule="auto"/>
             </w:pPr>
             <w:r>
               <w:rPr>
-                <w:b w:val="0"/>
-                <w:i w:val="0"/>
-                <w:sz w:val="20"/>
+                <w:rFonts w:ascii="Calibri" w:hAnsi="Calibri"/>
+                <w:color w:val="334155"/>
+                <w:sz w:val="19"/>
               </w:rPr>
-              <w:t>- data_pipeline.py: cosine_similarity_score() — công thức</w:t>
-              <w:br/>
-              <w:t xml:space="preserve">  Cosine Similarity, xử lý edge case norm=0.</w:t>
+              <w:t>- app.py: Lập trình module Explainable AI (XAI) explain_decision(): Truy vết đường đi qua cây nhị phân bằng model.decision_path(input_df) và model.apply(input_df), duyệt ma trận thưa csr_matrix, bóc tách thuộc tính tree_.feature và ngưỡng tree_.threshold thành câu giải thích logic tiếng Việt tự nhiên cho từng điều kiện điểm số.</w:t>
             </w:r>
           </w:p>
           <w:p>
             <w:pPr>
-              <w:spacing w:before="20" w:after="20"/>
+              <w:spacing w:before="0" w:after="40" w:line="269" w:lineRule="auto"/>
             </w:pPr>
             <w:r>
               <w:rPr>
-                <w:b w:val="0"/>
-                <w:i w:val="0"/>
-                <w:sz w:val="20"/>
+                <w:rFonts w:ascii="Calibri" w:hAnsi="Calibri"/>
+                <w:color w:val="334155"/>
+                <w:sz w:val="19"/>
               </w:rPr>
-              <w:t>- data_pipeline.py: Định nghĩa và tinh chỉnh 5 Career Profile</w:t>
-              <w:br/>
-              <w:t xml:space="preserve">  Vectors (20 chiều, trọng số [0–1] theo yêu cầu nghề nghiệp).</w:t>
+              <w:t>- app.py: Thiết kế bộ điều khiển máy trạng thái hữu hạn (Finite State Machine) quản lý luồng tương tác Wizard qua st.session_state (step = 1 -&gt; 2 -&gt; 2.5 -&gt; 3), đảm bảo duy trì dữ liệu qua các lần re-render của Streamlit.</w:t>
             </w:r>
           </w:p>
           <w:p>
             <w:pPr>
-              <w:spacing w:before="20" w:after="20"/>
+              <w:spacing w:before="0" w:after="40" w:line="269" w:lineRule="auto"/>
             </w:pPr>
             <w:r>
               <w:rPr>
-                <w:b w:val="0"/>
-                <w:i w:val="0"/>
-                <w:sz w:val="20"/>
+                <w:rFonts w:ascii="Calibri" w:hAnsi="Calibri"/>
+                <w:color w:val="334155"/>
+                <w:sz w:val="19"/>
               </w:rPr>
+              <w:t>- app.py: Cài đặt Singleton Cache @st.cache_resource cho hàm load_model() nạp file dss_brain.pkl vào RAM an toàn, phản hồi tức thì.</w:t>
             </w:r>
           </w:p>
           <w:p>
             <w:pPr>
-              <w:spacing w:before="20" w:after="20"/>
+              <w:spacing w:before="0" w:after="40" w:line="269" w:lineRule="auto"/>
             </w:pPr>
             <w:r>
               <w:rPr>
+                <w:rFonts w:ascii="Calibri" w:hAnsi="Calibri"/>
+                <w:color w:val="334155"/>
+                <w:sz w:val="19"/>
+              </w:rPr>
+              <w:t>- Xây dựng từ điển khuyến nghị hành động CAREER_ADVICE (kỹ năng, công nghệ, chứng chỉ quốc tế) cho 5 chuyên ngành.</w:t>
+            </w:r>
+          </w:p>
+          <w:p>
+            <w:pPr>
+              <w:spacing w:before="0" w:after="40" w:line="269" w:lineRule="auto"/>
+            </w:pPr>
+          </w:p>
+          <w:p>
+            <w:pPr>
+              <w:spacing w:before="0" w:after="40" w:line="269" w:lineRule="auto"/>
+            </w:pPr>
+            <w:r>
+              <w:rPr>
+                <w:rFonts w:ascii="Calibri" w:hAnsi="Calibri"/>
                 <w:b/>
-                <w:i w:val="0"/>
+                <w:color w:val="0D9488"/>
                 <w:sz w:val="20"/>
               </w:rPr>
               <w:t>Báo cáo Word:</w:t>
@@ -399,55 +554,86 @@
           </w:p>
           <w:p>
             <w:pPr>
-              <w:spacing w:before="20" w:after="20"/>
+              <w:spacing w:before="0" w:after="40" w:line="269" w:lineRule="auto"/>
             </w:pPr>
             <w:r>
               <w:rPr>
-                <w:b w:val="0"/>
-                <w:i w:val="0"/>
-                <w:sz w:val="20"/>
+                <w:rFonts w:ascii="Calibri" w:hAnsi="Calibri"/>
+                <w:color w:val="334155"/>
+                <w:sz w:val="19"/>
               </w:rPr>
-              <w:t>Chương 1: Cơ sở lý thuyết DSS — định nghĩa, 3 thành phần.</w:t>
+              <w:t>- Chương 1 (Cơ sở Lý thuyết DSS): Khái niệm Hệ trợ giúp quyết định (DSS), phân biệt DSS với hệ thống tự động hóa tác nghiệp, bài toán bán cấu trúc trong hướng nghiệp.</w:t>
             </w:r>
           </w:p>
           <w:p>
             <w:pPr>
-              <w:spacing w:before="20" w:after="20"/>
+              <w:spacing w:before="0" w:after="40" w:line="269" w:lineRule="auto"/>
             </w:pPr>
             <w:r>
               <w:rPr>
-                <w:b w:val="0"/>
-                <w:i w:val="0"/>
-                <w:sz w:val="20"/>
+                <w:rFonts w:ascii="Calibri" w:hAnsi="Calibri"/>
+                <w:color w:val="334155"/>
+                <w:sz w:val="19"/>
               </w:rPr>
-              <w:t>Chương 3: Cosine Similarity (công thức, lý do chọn), đánh giá mô hình</w:t>
-              <w:br/>
-              <w:t>(Precision, Recall, F1, Confusion Matrix).</w:t>
+              <w:t>- Chương 3 (Module Logic Tầng 3 &amp; XAI): Phân tích công thức toán Hybrid Scoring, cơ chế điểm thưởng sở thích; phân biệt hai khái niệm Interpretability vs Explainability trong AI; nguyên lý hoạt động của Streamlit Reactive Execution và Session State.</w:t>
             </w:r>
           </w:p>
           <w:p>
             <w:pPr>
-              <w:spacing w:before="20" w:after="20"/>
+              <w:spacing w:before="0" w:after="40" w:line="269" w:lineRule="auto"/>
+            </w:pPr>
+          </w:p>
+          <w:p>
+            <w:pPr>
+              <w:spacing w:before="0" w:after="40" w:line="269" w:lineRule="auto"/>
             </w:pPr>
             <w:r>
               <w:rPr>
-                <w:b w:val="0"/>
-                <w:i w:val="0"/>
+                <w:rFonts w:ascii="Calibri" w:hAnsi="Calibri"/>
+                <w:b/>
+                <w:color w:val="B45309"/>
                 <w:sz w:val="20"/>
               </w:rPr>
+              <w:t>Canva / Slide Thuyết trình:</w:t>
             </w:r>
           </w:p>
           <w:p>
             <w:pPr>
-              <w:spacing w:before="20" w:after="20"/>
+              <w:spacing w:before="0" w:after="40" w:line="269" w:lineRule="auto"/>
             </w:pPr>
             <w:r>
               <w:rPr>
-                <w:b w:val="0"/>
-                <w:i w:val="0"/>
-                <w:sz w:val="20"/>
+                <w:rFonts w:ascii="Calibri" w:hAnsi="Calibri"/>
+                <w:color w:val="334155"/>
+                <w:sz w:val="19"/>
               </w:rPr>
-              <w:t>Canva: Slide lý thuyết DSS, Cosine Similarity, kết quả đánh giá.</w:t>
+              <w:t>- Slide Cơ sở Lý thuyết Hệ trợ giúp quyết định (DSS).</w:t>
+            </w:r>
+          </w:p>
+          <w:p>
+            <w:pPr>
+              <w:spacing w:before="0" w:after="40" w:line="269" w:lineRule="auto"/>
+            </w:pPr>
+            <w:r>
+              <w:rPr>
+                <w:rFonts w:ascii="Calibri" w:hAnsi="Calibri"/>
+                <w:color w:val="334155"/>
+                <w:sz w:val="19"/>
+              </w:rPr>
+              <w:t>- Slide Cơ chế Hybrid Scoring (kết hợp năng lực học tập 90% + sở thích 10%).</w:t>
+            </w:r>
+          </w:p>
+          <w:p>
+            <w:pPr>
+              <w:spacing w:before="0" w:after="40" w:line="269" w:lineRule="auto"/>
+            </w:pPr>
+            <w:r>
+              <w:rPr>
+                <w:rFonts w:ascii="Calibri" w:hAnsi="Calibri"/>
+                <w:color w:val="334155"/>
+                <w:sz w:val="19"/>
+              </w:rPr>
+              <w:t>- Slide Minh họa Cây giải thích minh bạch XAI (Explainable AI).</w:t>
             </w:r>
           </w:p>
         </w:tc>
@@ -455,15 +641,21 @@
       <w:tr>
         <w:tc>
           <w:tcPr>
-            <w:tcW w:type="dxa" w:w="1984"/>
+            <w:tcW w:type="dxa" w:w="2160"/>
+            <w:shd w:fill="FFFFFF"/>
+            <w:tcMar>
+              <w:top w:w="80" w:type="dxa"/>
+              <w:bottom w:w="80" w:type="dxa"/>
+              <w:left w:w="100" w:type="dxa"/>
+              <w:right w:w="100" w:type="dxa"/>
+            </w:tcMar>
           </w:tcPr>
           <w:p>
-            <w:pPr>
-              <w:jc w:val="center"/>
-            </w:pPr>
             <w:r>
               <w:rPr>
+                <w:rFonts w:ascii="Calibri" w:hAnsi="Calibri"/>
                 <w:b/>
+                <w:color w:val="1E293B"/>
                 <w:sz w:val="21"/>
               </w:rPr>
               <w:t>Phạm Khánh Ly</w:t>
@@ -472,7 +664,14 @@
         </w:tc>
         <w:tc>
           <w:tcPr>
-            <w:tcW w:type="dxa" w:w="1701"/>
+            <w:tcW w:type="dxa" w:w="1728"/>
+            <w:shd w:fill="FFFFFF"/>
+            <w:tcMar>
+              <w:top w:w="80" w:type="dxa"/>
+              <w:bottom w:w="80" w:type="dxa"/>
+              <w:left w:w="100" w:type="dxa"/>
+              <w:right w:w="100" w:type="dxa"/>
+            </w:tcMar>
           </w:tcPr>
           <w:p>
             <w:pPr>
@@ -480,7 +679,9 @@
             </w:pPr>
             <w:r>
               <w:rPr>
-                <w:sz w:val="21"/>
+                <w:rFonts w:ascii="Calibri" w:hAnsi="Calibri"/>
+                <w:color w:val="475569"/>
+                <w:sz w:val="20"/>
               </w:rPr>
               <w:t>2355010134</w:t>
             </w:r>
@@ -488,84 +689,122 @@
         </w:tc>
         <w:tc>
           <w:tcPr>
-            <w:tcW w:type="dxa" w:w="5953"/>
+            <w:tcW w:type="dxa" w:w="6192"/>
+            <w:shd w:fill="FFFFFF"/>
+            <w:tcMar>
+              <w:top w:w="80" w:type="dxa"/>
+              <w:bottom w:w="80" w:type="dxa"/>
+              <w:left w:w="100" w:type="dxa"/>
+              <w:right w:w="100" w:type="dxa"/>
+            </w:tcMar>
           </w:tcPr>
           <w:p>
             <w:pPr>
-              <w:spacing w:before="20" w:after="20"/>
+              <w:spacing w:before="0" w:after="40" w:line="269" w:lineRule="auto"/>
             </w:pPr>
+            <w:r/>
             <w:r>
               <w:rPr>
+                <w:rFonts w:ascii="Calibri" w:hAnsi="Calibri"/>
                 <w:b/>
-                <w:i w:val="0"/>
+                <w:color w:val="1E3A8A"/>
                 <w:sz w:val="20"/>
               </w:rPr>
-              <w:t>Pipeline Dữ liệu &amp; Validation:</w:t>
+              <w:t>Chuẩn hóa Ngôn ngữ &amp; Từ điển Bí danh Môn học (NLP &amp; Aliases Developer):</w:t>
             </w:r>
           </w:p>
           <w:p>
             <w:pPr>
-              <w:spacing w:before="20" w:after="20"/>
+              <w:spacing w:before="0" w:after="40" w:line="269" w:lineRule="auto"/>
             </w:pPr>
             <w:r>
               <w:rPr>
-                <w:b w:val="0"/>
-                <w:i w:val="0"/>
-                <w:sz w:val="20"/>
+                <w:rFonts w:ascii="Calibri" w:hAnsi="Calibri"/>
+                <w:color w:val="334155"/>
+                <w:sz w:val="19"/>
               </w:rPr>
-              <w:t>- app.py: load_model() (@st.cache_resource, guard feature_names_in_),</w:t>
-              <w:br/>
-              <w:t xml:space="preserve">  validate_scores() (pure function trả tuple (bool, str)).</w:t>
+              <w:t>- pdf_extractor.py: Chuẩn hóa danh mục 24 môn học chính thức SUBJECT_CODES theo chuẩn chương trình đào tạo Khoa CNTT - HAU.</w:t>
             </w:r>
           </w:p>
           <w:p>
             <w:pPr>
-              <w:spacing w:before="20" w:after="20"/>
+              <w:spacing w:before="0" w:after="40" w:line="269" w:lineRule="auto"/>
             </w:pPr>
             <w:r>
               <w:rPr>
-                <w:b w:val="0"/>
-                <w:i w:val="0"/>
-                <w:sz w:val="20"/>
+                <w:rFonts w:ascii="Calibri" w:hAnsi="Calibri"/>
+                <w:color w:val="334155"/>
+                <w:sz w:val="19"/>
               </w:rPr>
-              <w:t>- data_pipeline.py: assign_labels() (vòng lặp gán nhãn</w:t>
-              <w:br/>
-              <w:t xml:space="preserve">  Cosine Similarity cho từng sinh viên), run_pipeline().</w:t>
+              <w:t>- pdf_extractor.py: Xây dựng từ điển bí danh _ALIASES_RAW với hơn 100 biến thể tên môn học viết hoa, viết thường, có dấu, không dấu, viết tắt (csdl, ttnt, ctdl, c#, hdh, pttkhttt...).</w:t>
             </w:r>
           </w:p>
           <w:p>
             <w:pPr>
-              <w:spacing w:before="20" w:after="20"/>
+              <w:spacing w:before="0" w:after="40" w:line="269" w:lineRule="auto"/>
             </w:pPr>
             <w:r>
               <w:rPr>
-                <w:b w:val="0"/>
-                <w:i w:val="0"/>
-                <w:sz w:val="20"/>
+                <w:rFonts w:ascii="Calibri" w:hAnsi="Calibri"/>
+                <w:color w:val="334155"/>
+                <w:sz w:val="19"/>
               </w:rPr>
-              <w:t>- Hằng số FEATURE_ORDER (thứ tự 20 môn học cố định).</w:t>
+              <w:t>- pdf_extractor.py: Viết hàm remove_accents() sử dụng thư viện chuẩn unicodedata theo chuẩn NFD để tách và loại bỏ toàn bộ dấu thanh, dấu mũ tiếng Việt.</w:t>
             </w:r>
           </w:p>
           <w:p>
             <w:pPr>
-              <w:spacing w:before="20" w:after="20"/>
+              <w:spacing w:before="0" w:after="40" w:line="269" w:lineRule="auto"/>
             </w:pPr>
             <w:r>
               <w:rPr>
-                <w:b w:val="0"/>
-                <w:i w:val="0"/>
-                <w:sz w:val="20"/>
+                <w:rFonts w:ascii="Calibri" w:hAnsi="Calibri"/>
+                <w:color w:val="334155"/>
+                <w:sz w:val="19"/>
               </w:rPr>
+              <w:t>- pdf_extractor.py: Viết hàm _norm_key() làm sạch khoảng trắng thừa, xóa ký tự đặc biệt lạ và bảo tồn ký tự '#' dành riêng cho môn C#.</w:t>
             </w:r>
           </w:p>
           <w:p>
             <w:pPr>
-              <w:spacing w:before="20" w:after="20"/>
+              <w:spacing w:before="0" w:after="40" w:line="269" w:lineRule="auto"/>
             </w:pPr>
             <w:r>
               <w:rPr>
+                <w:rFonts w:ascii="Calibri" w:hAnsi="Calibri"/>
+                <w:color w:val="334155"/>
+                <w:sz w:val="19"/>
+              </w:rPr>
+              <w:t>- pdf_extractor.py: Tích hợp thuật toán so khớp gần đúng (Fuzzy Matching) difflib.get_close_matches(cutoff=0.82) giúp hệ thống tự động nhận diện chính xác ngay cả khi tên môn trong PDF bị gõ sai chính tả nhẹ.</w:t>
+            </w:r>
+          </w:p>
+          <w:p>
+            <w:pPr>
+              <w:spacing w:before="0" w:after="40" w:line="269" w:lineRule="auto"/>
+            </w:pPr>
+            <w:r>
+              <w:rPr>
+                <w:rFonts w:ascii="Calibri" w:hAnsi="Calibri"/>
+                <w:color w:val="334155"/>
+                <w:sz w:val="19"/>
+              </w:rPr>
+              <w:t>- Hỗ trợ chạy thử nghiệm bóc tách từ khóa trên các file PDF bảng điểm mẫu của trường.</w:t>
+            </w:r>
+          </w:p>
+          <w:p>
+            <w:pPr>
+              <w:spacing w:before="0" w:after="40" w:line="269" w:lineRule="auto"/>
+            </w:pPr>
+          </w:p>
+          <w:p>
+            <w:pPr>
+              <w:spacing w:before="0" w:after="40" w:line="269" w:lineRule="auto"/>
+            </w:pPr>
+            <w:r>
+              <w:rPr>
+                <w:rFonts w:ascii="Calibri" w:hAnsi="Calibri"/>
                 <w:b/>
-                <w:i w:val="0"/>
+                <w:color w:val="0D9488"/>
                 <w:sz w:val="20"/>
               </w:rPr>
               <w:t>Báo cáo Word:</w:t>
@@ -573,79 +812,86 @@
           </w:p>
           <w:p>
             <w:pPr>
-              <w:spacing w:before="20" w:after="20"/>
+              <w:spacing w:before="0" w:after="40" w:line="269" w:lineRule="auto"/>
             </w:pPr>
             <w:r>
               <w:rPr>
-                <w:b w:val="0"/>
-                <w:i w:val="0"/>
-                <w:sz w:val="20"/>
+                <w:rFonts w:ascii="Calibri" w:hAnsi="Calibri"/>
+                <w:color w:val="334155"/>
+                <w:sz w:val="19"/>
               </w:rPr>
-              <w:t>Chương 1: Tổng quan đề tài, mục tiêu, phạm vi.</w:t>
+              <w:t>- Chương 1 (Tổng quan Đề tài): Đặt vấn đề khó khăn của sinh viên khi chọn chuyên ngành, mục tiêu đề tài, phạm vi nghiên cứu và ý nghĩa thực tiễn của hệ thống.</w:t>
             </w:r>
           </w:p>
           <w:p>
             <w:pPr>
-              <w:spacing w:before="20" w:after="20"/>
+              <w:spacing w:before="0" w:after="40" w:line="269" w:lineRule="auto"/>
             </w:pPr>
             <w:r>
               <w:rPr>
-                <w:b w:val="0"/>
-                <w:i w:val="0"/>
-                <w:sz w:val="20"/>
+                <w:rFonts w:ascii="Calibri" w:hAnsi="Calibri"/>
+                <w:color w:val="334155"/>
+                <w:sz w:val="19"/>
               </w:rPr>
-              <w:t>Chương 2: Use Case sinh viên (UC-04 → UC-09), bảng mô tả.</w:t>
+              <w:t>- Bảng Danh mục 24 Môn học &amp; Từ điển Bí danh: Xây dựng bảng đối chiếu 24 môn học với các cách viết tắt thường gặp trong bảng điểm HAU.</w:t>
             </w:r>
           </w:p>
           <w:p>
             <w:pPr>
-              <w:spacing w:before="20" w:after="20"/>
+              <w:spacing w:before="0" w:after="40" w:line="269" w:lineRule="auto"/>
             </w:pPr>
             <w:r>
               <w:rPr>
-                <w:b w:val="0"/>
-                <w:i w:val="0"/>
-                <w:sz w:val="20"/>
+                <w:rFonts w:ascii="Calibri" w:hAnsi="Calibri"/>
+                <w:color w:val="334155"/>
+                <w:sz w:val="19"/>
               </w:rPr>
-              <w:t>Chương 3: Tầng 1 — gán nhãn Content-Based Filtering.</w:t>
+              <w:t>- Tham gia soạn thảo mục Hướng dẫn xuất và tải file PDF bảng điểm cá nhân trong Sổ tay HDSD (01_Huong_Dan_Su_Dung.docx).</w:t>
             </w:r>
           </w:p>
           <w:p>
             <w:pPr>
-              <w:spacing w:before="20" w:after="20"/>
+              <w:spacing w:before="0" w:after="40" w:line="269" w:lineRule="auto"/>
+            </w:pPr>
+          </w:p>
+          <w:p>
+            <w:pPr>
+              <w:spacing w:before="0" w:after="40" w:line="269" w:lineRule="auto"/>
             </w:pPr>
             <w:r>
               <w:rPr>
-                <w:b w:val="0"/>
-                <w:i/>
+                <w:rFonts w:ascii="Calibri" w:hAnsi="Calibri"/>
+                <w:b/>
+                <w:color w:val="B45309"/>
                 <w:sz w:val="20"/>
               </w:rPr>
-              <w:t>Đảm nhiệm định dạng tổng thể báo cáo Word (font, heading, mục lục).</w:t>
+              <w:t>Canva / Slide Thuyết trình:</w:t>
             </w:r>
           </w:p>
           <w:p>
             <w:pPr>
-              <w:spacing w:before="20" w:after="20"/>
+              <w:spacing w:before="0" w:after="40" w:line="269" w:lineRule="auto"/>
             </w:pPr>
             <w:r>
               <w:rPr>
-                <w:b w:val="0"/>
-                <w:i w:val="0"/>
-                <w:sz w:val="20"/>
+                <w:rFonts w:ascii="Calibri" w:hAnsi="Calibri"/>
+                <w:color w:val="334155"/>
+                <w:sz w:val="19"/>
               </w:rPr>
+              <w:t>- Thiết kế Template tổng thể slide chuẩn phong cách nhận diện thương hiệu Đại học Kiến trúc Hà Nội (màu xanh Navy và Cam đất).</w:t>
             </w:r>
           </w:p>
           <w:p>
             <w:pPr>
-              <w:spacing w:before="20" w:after="20"/>
+              <w:spacing w:before="0" w:after="40" w:line="269" w:lineRule="auto"/>
             </w:pPr>
             <w:r>
               <w:rPr>
-                <w:b w:val="0"/>
-                <w:i w:val="0"/>
-                <w:sz w:val="20"/>
+                <w:rFonts w:ascii="Calibri" w:hAnsi="Calibri"/>
+                <w:color w:val="334155"/>
+                <w:sz w:val="19"/>
               </w:rPr>
-              <w:t>Canva: Template tổng thể slide, slide tổng quan đề tài, Use Case.</w:t>
+              <w:t>- Slide Giới thiệu Nhóm và Bối cảnh đề tài, slide Danh mục 24 môn học và các định hướng chuyên ngành.</w:t>
             </w:r>
           </w:p>
         </w:tc>
@@ -653,16 +899,21 @@
       <w:tr>
         <w:tc>
           <w:tcPr>
-            <w:tcW w:type="dxa" w:w="1984"/>
-            <w:shd w:val="clear" w:color="auto" w:fill="F1F5F9"/>
+            <w:tcW w:type="dxa" w:w="2160"/>
+            <w:shd w:fill="F8FAFC"/>
+            <w:tcMar>
+              <w:top w:w="80" w:type="dxa"/>
+              <w:bottom w:w="80" w:type="dxa"/>
+              <w:left w:w="100" w:type="dxa"/>
+              <w:right w:w="100" w:type="dxa"/>
+            </w:tcMar>
           </w:tcPr>
           <w:p>
-            <w:pPr>
-              <w:jc w:val="center"/>
-            </w:pPr>
             <w:r>
               <w:rPr>
+                <w:rFonts w:ascii="Calibri" w:hAnsi="Calibri"/>
                 <w:b/>
+                <w:color w:val="1E293B"/>
                 <w:sz w:val="21"/>
               </w:rPr>
               <w:t>Đặng Thị Phương Nga</w:t>
@@ -671,8 +922,14 @@
         </w:tc>
         <w:tc>
           <w:tcPr>
-            <w:tcW w:type="dxa" w:w="1701"/>
-            <w:shd w:val="clear" w:color="auto" w:fill="F1F5F9"/>
+            <w:tcW w:type="dxa" w:w="1728"/>
+            <w:shd w:fill="F8FAFC"/>
+            <w:tcMar>
+              <w:top w:w="80" w:type="dxa"/>
+              <w:bottom w:w="80" w:type="dxa"/>
+              <w:left w:w="100" w:type="dxa"/>
+              <w:right w:w="100" w:type="dxa"/>
+            </w:tcMar>
           </w:tcPr>
           <w:p>
             <w:pPr>
@@ -680,7 +937,9 @@
             </w:pPr>
             <w:r>
               <w:rPr>
-                <w:sz w:val="21"/>
+                <w:rFonts w:ascii="Calibri" w:hAnsi="Calibri"/>
+                <w:color w:val="475569"/>
+                <w:sz w:val="20"/>
               </w:rPr>
               <w:t>2355010146</w:t>
             </w:r>
@@ -688,87 +947,109 @@
         </w:tc>
         <w:tc>
           <w:tcPr>
-            <w:tcW w:type="dxa" w:w="5953"/>
-            <w:shd w:val="clear" w:color="auto" w:fill="F1F5F9"/>
+            <w:tcW w:type="dxa" w:w="6192"/>
+            <w:shd w:fill="F8FAFC"/>
+            <w:tcMar>
+              <w:top w:w="80" w:type="dxa"/>
+              <w:bottom w:w="80" w:type="dxa"/>
+              <w:left w:w="100" w:type="dxa"/>
+              <w:right w:w="100" w:type="dxa"/>
+            </w:tcMar>
           </w:tcPr>
           <w:p>
             <w:pPr>
-              <w:spacing w:before="20" w:after="20"/>
+              <w:spacing w:before="0" w:after="40" w:line="269" w:lineRule="auto"/>
             </w:pPr>
+            <w:r/>
             <w:r>
               <w:rPr>
+                <w:rFonts w:ascii="Calibri" w:hAnsi="Calibri"/>
                 <w:b/>
-                <w:i w:val="0"/>
+                <w:color w:val="1E3A8A"/>
                 <w:sz w:val="20"/>
               </w:rPr>
-              <w:t>Thu thập Dữ liệu &amp; Giao diện:</w:t>
+              <w:t>Bóc tách Cấu trúc Bảng PDF &amp; Hợp nhất Dữ liệu (Table Parsing &amp; Merging Developer):</w:t>
             </w:r>
           </w:p>
           <w:p>
             <w:pPr>
-              <w:spacing w:before="20" w:after="20"/>
+              <w:spacing w:before="0" w:after="40" w:line="269" w:lineRule="auto"/>
             </w:pPr>
             <w:r>
               <w:rPr>
-                <w:b w:val="0"/>
-                <w:i w:val="0"/>
-                <w:sz w:val="20"/>
+                <w:rFonts w:ascii="Calibri" w:hAnsi="Calibri"/>
+                <w:color w:val="334155"/>
+                <w:sz w:val="19"/>
               </w:rPr>
-              <w:t>- pdf_extractor.py: extract_scores_from_pdf() — đọc bảng PDF</w:t>
-              <w:br/>
-              <w:t xml:space="preserve">  bằng pdfplumber, trích xuất Mã SV + điểm TBCMH.</w:t>
+              <w:t>- pdf_extractor.py: Tham gia lập trình hàm extract_scores_from_student_pdf(): Thuật toán nhận diện tiêu đề cột động (code_col_idx, subject_col_idx, score_col_idx), bóc tách Họ tên và Mã sinh viên bằng Regex, lọc bỏ bảng 'Học phần chưa tích lũy'.</w:t>
             </w:r>
           </w:p>
           <w:p>
             <w:pPr>
-              <w:spacing w:before="20" w:after="20"/>
+              <w:spacing w:before="0" w:after="40" w:line="269" w:lineRule="auto"/>
             </w:pPr>
             <w:r>
               <w:rPr>
-                <w:b w:val="0"/>
-                <w:i w:val="0"/>
-                <w:sz w:val="20"/>
+                <w:rFonts w:ascii="Calibri" w:hAnsi="Calibri"/>
+                <w:color w:val="334155"/>
+                <w:sz w:val="19"/>
               </w:rPr>
-              <w:t>- data_pipeline.py: load_raw_data() + clean_data() — chuẩn hóa</w:t>
-              <w:br/>
-              <w:t xml:space="preserve">  tên cột, fillna(0.0) cho môn chưa học.</w:t>
+              <w:t>- pdf_extractor.py: Cài đặt kỹ thuật nối dòng multiline stitching pending_subj xử lý triệt để hiện tượng tên môn dài bị ngắt làm 2 dòng liên tiếp trong bảng PDF.</w:t>
             </w:r>
           </w:p>
           <w:p>
             <w:pPr>
-              <w:spacing w:before="20" w:after="20"/>
+              <w:spacing w:before="0" w:after="40" w:line="269" w:lineRule="auto"/>
             </w:pPr>
             <w:r>
               <w:rPr>
-                <w:b w:val="0"/>
-                <w:i w:val="0"/>
-                <w:sz w:val="20"/>
+                <w:rFonts w:ascii="Calibri" w:hAnsi="Calibri"/>
+                <w:color w:val="334155"/>
+                <w:sz w:val="19"/>
               </w:rPr>
-              <w:t>- app.py: Page config, Sidebar, Tab 2 (hiển thị Confusion Matrix</w:t>
-              <w:br/>
-              <w:t xml:space="preserve">  và sơ đồ cây quyết định).</w:t>
+              <w:t>- pdf_extractor.py: Cài đặt quy tắc xử lý môn học lại: luôn so sánh và lưu điểm của lần thi cao nhất max(scores[subj], score_val).</w:t>
             </w:r>
           </w:p>
           <w:p>
             <w:pPr>
-              <w:spacing w:before="20" w:after="20"/>
+              <w:spacing w:before="0" w:after="40" w:line="269" w:lineRule="auto"/>
             </w:pPr>
             <w:r>
               <w:rPr>
-                <w:b w:val="0"/>
-                <w:i w:val="0"/>
-                <w:sz w:val="20"/>
+                <w:rFonts w:ascii="Calibri" w:hAnsi="Calibri"/>
+                <w:color w:val="334155"/>
+                <w:sz w:val="19"/>
               </w:rPr>
+              <w:t>- merge_new_data.py: Viết script đọc và hợp nhất 4 môn chuyên ngành mới (Java, C#, Web, TTNT) của 70 sinh viên bằng Pandas (df.loc[] và pd.concat), quản lý và gán giá trị đặc biệt -1.0 cho các môn sinh viên chưa học.</w:t>
             </w:r>
           </w:p>
           <w:p>
             <w:pPr>
-              <w:spacing w:before="20" w:after="20"/>
+              <w:spacing w:before="0" w:after="40" w:line="269" w:lineRule="auto"/>
             </w:pPr>
             <w:r>
               <w:rPr>
+                <w:rFonts w:ascii="Calibri" w:hAnsi="Calibri"/>
+                <w:color w:val="334155"/>
+                <w:sz w:val="19"/>
+              </w:rPr>
+              <w:t>- Đảm nhiệm kiểm tra chất lượng dữ liệu (Data Quality Audit): Đối soát dữ liệu sau khi merge, xác nhận đủ 24 cột môn học và 1.326 sinh viên.</w:t>
+            </w:r>
+          </w:p>
+          <w:p>
+            <w:pPr>
+              <w:spacing w:before="0" w:after="40" w:line="269" w:lineRule="auto"/>
+            </w:pPr>
+          </w:p>
+          <w:p>
+            <w:pPr>
+              <w:spacing w:before="0" w:after="40" w:line="269" w:lineRule="auto"/>
+            </w:pPr>
+            <w:r>
+              <w:rPr>
+                <w:rFonts w:ascii="Calibri" w:hAnsi="Calibri"/>
                 <w:b/>
-                <w:i w:val="0"/>
+                <w:color w:val="0D9488"/>
                 <w:sz w:val="20"/>
               </w:rPr>
               <w:t>Báo cáo Word:</w:t>
@@ -776,66 +1057,86 @@
           </w:p>
           <w:p>
             <w:pPr>
-              <w:spacing w:before="20" w:after="20"/>
+              <w:spacing w:before="0" w:after="40" w:line="269" w:lineRule="auto"/>
             </w:pPr>
             <w:r>
               <w:rPr>
-                <w:b w:val="0"/>
-                <w:i w:val="0"/>
-                <w:sz w:val="20"/>
+                <w:rFonts w:ascii="Calibri" w:hAnsi="Calibri"/>
+                <w:color w:val="334155"/>
+                <w:sz w:val="19"/>
               </w:rPr>
-              <w:t>Chương 2: Use Case Admin (UC-01→03), sơ đồ UML, sơ đồ kiến trúc.</w:t>
+              <w:t>- Chương 4 (Phần Đánh giá &amp; Kết quả Thực nghiệm): Phân tích đặc điểm tập dữ liệu 1.326 sinh viên; giải thích ý nghĩa triết lý sâu sắc của giá trị -1.0 (Chưa học) so với 0.0 (Học bị điểm liệt).</w:t>
             </w:r>
           </w:p>
           <w:p>
             <w:pPr>
-              <w:spacing w:before="20" w:after="20"/>
+              <w:spacing w:before="0" w:after="40" w:line="269" w:lineRule="auto"/>
             </w:pPr>
             <w:r>
               <w:rPr>
-                <w:b w:val="0"/>
-                <w:i w:val="0"/>
-                <w:sz w:val="20"/>
+                <w:rFonts w:ascii="Calibri" w:hAnsi="Calibri"/>
+                <w:color w:val="334155"/>
+                <w:sz w:val="19"/>
               </w:rPr>
-              <w:t>Chương 4: Tổng kết &amp; Hướng phát triển.</w:t>
+              <w:t>- Chương 5 (Kết luận &amp; Hướng Phát Triển): Đánh giá ưu điểm, hạn chế và đề xuất 3 hướng mở rộng chiến lược cho hệ thống.</w:t>
             </w:r>
           </w:p>
           <w:p>
             <w:pPr>
-              <w:spacing w:before="20" w:after="20"/>
+              <w:spacing w:before="0" w:after="40" w:line="269" w:lineRule="auto"/>
             </w:pPr>
             <w:r>
               <w:rPr>
-                <w:b w:val="0"/>
-                <w:i/>
-                <w:sz w:val="20"/>
+                <w:rFonts w:ascii="Calibri" w:hAnsi="Calibri"/>
+                <w:color w:val="334155"/>
+                <w:sz w:val="19"/>
               </w:rPr>
-              <w:t>Đảm nhiệm ghép chương và xuất PDF báo cáo cuối cùng.</w:t>
+              <w:t>- Trưởng ban Biên tập Báo cáo: Chịu trách nhiệm tổng hợp các chương từ 5 thành viên, chuẩn hóa thống nhất font chữ (Calibri/Arial), giãn cách dòng, căn chỉnh lề, tạo mục lục tự động và xuất file PDF hoàn chỉnh nộp cho giảng viên.</w:t>
             </w:r>
           </w:p>
           <w:p>
             <w:pPr>
-              <w:spacing w:before="20" w:after="20"/>
+              <w:spacing w:before="0" w:after="40" w:line="269" w:lineRule="auto"/>
+            </w:pPr>
+          </w:p>
+          <w:p>
+            <w:pPr>
+              <w:spacing w:before="0" w:after="40" w:line="269" w:lineRule="auto"/>
             </w:pPr>
             <w:r>
               <w:rPr>
-                <w:b w:val="0"/>
-                <w:i w:val="0"/>
+                <w:rFonts w:ascii="Calibri" w:hAnsi="Calibri"/>
+                <w:b/>
+                <w:color w:val="B45309"/>
                 <w:sz w:val="20"/>
               </w:rPr>
+              <w:t>Canva / Slide Thuyết trình:</w:t>
             </w:r>
           </w:p>
           <w:p>
             <w:pPr>
-              <w:spacing w:before="20" w:after="20"/>
+              <w:spacing w:before="0" w:after="40" w:line="269" w:lineRule="auto"/>
             </w:pPr>
             <w:r>
               <w:rPr>
-                <w:b w:val="0"/>
-                <w:i w:val="0"/>
-                <w:sz w:val="20"/>
+                <w:rFonts w:ascii="Calibri" w:hAnsi="Calibri"/>
+                <w:color w:val="334155"/>
+                <w:sz w:val="19"/>
               </w:rPr>
-              <w:t>Canva: Slide dữ liệu PDF, slide tổng kết, animation chuyển slide.</w:t>
+              <w:t>- Slide Dữ liệu thực nghiệm 1.326 sinh viên và quy trình tiền xử lý dữ liệu.</w:t>
+            </w:r>
+          </w:p>
+          <w:p>
+            <w:pPr>
+              <w:spacing w:before="0" w:after="40" w:line="269" w:lineRule="auto"/>
+            </w:pPr>
+            <w:r>
+              <w:rPr>
+                <w:rFonts w:ascii="Calibri" w:hAnsi="Calibri"/>
+                <w:color w:val="334155"/>
+                <w:sz w:val="19"/>
+              </w:rPr>
+              <w:t>- Slide Kết luận, đánh giá ưu nhược điểm và hướng phát triển trong tương lai.</w:t>
             </w:r>
           </w:p>
         </w:tc>
@@ -843,15 +1144,21 @@
       <w:tr>
         <w:tc>
           <w:tcPr>
-            <w:tcW w:type="dxa" w:w="1984"/>
+            <w:tcW w:type="dxa" w:w="2160"/>
+            <w:shd w:fill="FFFFFF"/>
+            <w:tcMar>
+              <w:top w:w="80" w:type="dxa"/>
+              <w:bottom w:w="80" w:type="dxa"/>
+              <w:left w:w="100" w:type="dxa"/>
+              <w:right w:w="100" w:type="dxa"/>
+            </w:tcMar>
           </w:tcPr>
           <w:p>
-            <w:pPr>
-              <w:jc w:val="center"/>
-            </w:pPr>
             <w:r>
               <w:rPr>
+                <w:rFonts w:ascii="Calibri" w:hAnsi="Calibri"/>
                 <w:b/>
+                <w:color w:val="1E293B"/>
                 <w:sz w:val="21"/>
               </w:rPr>
               <w:t>Nguyễn Sơn Vũ</w:t>
@@ -860,7 +1167,14 @@
         </w:tc>
         <w:tc>
           <w:tcPr>
-            <w:tcW w:type="dxa" w:w="1701"/>
+            <w:tcW w:type="dxa" w:w="1728"/>
+            <w:shd w:fill="FFFFFF"/>
+            <w:tcMar>
+              <w:top w:w="80" w:type="dxa"/>
+              <w:bottom w:w="80" w:type="dxa"/>
+              <w:left w:w="100" w:type="dxa"/>
+              <w:right w:w="100" w:type="dxa"/>
+            </w:tcMar>
           </w:tcPr>
           <w:p>
             <w:pPr>
@@ -868,7 +1182,9 @@
             </w:pPr>
             <w:r>
               <w:rPr>
-                <w:sz w:val="21"/>
+                <w:rFonts w:ascii="Calibri" w:hAnsi="Calibri"/>
+                <w:color w:val="475569"/>
+                <w:sz w:val="20"/>
               </w:rPr>
               <w:t>2355010210</w:t>
             </w:r>
@@ -876,75 +1192,135 @@
         </w:tc>
         <w:tc>
           <w:tcPr>
-            <w:tcW w:type="dxa" w:w="5953"/>
+            <w:tcW w:type="dxa" w:w="6192"/>
+            <w:shd w:fill="FFFFFF"/>
+            <w:tcMar>
+              <w:top w:w="80" w:type="dxa"/>
+              <w:bottom w:w="80" w:type="dxa"/>
+              <w:left w:w="100" w:type="dxa"/>
+              <w:right w:w="100" w:type="dxa"/>
+            </w:tcMar>
           </w:tcPr>
           <w:p>
             <w:pPr>
-              <w:spacing w:before="20" w:after="20"/>
+              <w:spacing w:before="0" w:after="40" w:line="269" w:lineRule="auto"/>
             </w:pPr>
+            <w:r/>
             <w:r>
               <w:rPr>
+                <w:rFonts w:ascii="Calibri" w:hAnsi="Calibri"/>
                 <w:b/>
-                <w:i w:val="0"/>
+                <w:color w:val="0D9488"/>
                 <w:sz w:val="20"/>
               </w:rPr>
-              <w:t>Trích xuất PDF &amp; Trực quan hóa:</w:t>
+              <w:t>Giao diện Người dùng, Trực quan hóa Biểu đồ &amp; Xuất Báo cáo (UI &amp; Reporting Developer):</w:t>
             </w:r>
           </w:p>
           <w:p>
             <w:pPr>
-              <w:spacing w:before="20" w:after="20"/>
+              <w:spacing w:before="0" w:after="40" w:line="269" w:lineRule="auto"/>
             </w:pPr>
             <w:r>
               <w:rPr>
-                <w:b w:val="0"/>
-                <w:i w:val="0"/>
-                <w:sz w:val="20"/>
+                <w:rFonts w:ascii="Calibri" w:hAnsi="Calibri"/>
+                <w:color w:val="334155"/>
+                <w:sz w:val="19"/>
               </w:rPr>
-              <w:t>- pdf_extractor.py: SUBJECT_MAPPING (22 từ khóa → tên môn chuẩn),</w:t>
-              <w:br/>
-              <w:t xml:space="preserve">  match_subject() (longest-match-first), scan_all_pdfs()</w:t>
-              <w:br/>
-              <w:t xml:space="preserve">  (gộp điểm max khi sinh viên học lại), run_extraction().</w:t>
+              <w:t>- app.py: Thiết kế giao diện Bước 1: Form nhập Họ tên, Mã sinh viên, ô tích Chế độ Ẩn danh và khung lựa chọn đa sở thích công nghệ.</w:t>
             </w:r>
           </w:p>
           <w:p>
             <w:pPr>
-              <w:spacing w:before="20" w:after="20"/>
+              <w:spacing w:before="0" w:after="40" w:line="269" w:lineRule="auto"/>
             </w:pPr>
             <w:r>
               <w:rPr>
-                <w:b w:val="0"/>
-                <w:i w:val="0"/>
-                <w:sz w:val="20"/>
+                <w:rFonts w:ascii="Calibri" w:hAnsi="Calibri"/>
+                <w:color w:val="334155"/>
+                <w:sz w:val="19"/>
               </w:rPr>
-              <w:t>- app.py: Biểu đồ Plotly horizontal bar chart (sắp xếp tăng dần,</w:t>
-              <w:br/>
-              <w:t xml:space="preserve">  màu Viridis), hàm export Excel (BytesIO + openpyxl),</w:t>
-              <w:br/>
-              <w:t xml:space="preserve">  nút st.download_button.</w:t>
+              <w:t>- app.py: Thiết kế giao diện Bước 2: Hai tab nhập điểm linh hoạt (Kéo thả file PDF cá nhân và Nhập điểm thủ công lưới 3 cột 24 môn, validate điểm [0.0, 10.0]).</w:t>
             </w:r>
           </w:p>
           <w:p>
             <w:pPr>
-              <w:spacing w:before="20" w:after="20"/>
+              <w:spacing w:before="0" w:after="40" w:line="269" w:lineRule="auto"/>
             </w:pPr>
             <w:r>
               <w:rPr>
-                <w:b w:val="0"/>
-                <w:i w:val="0"/>
-                <w:sz w:val="20"/>
+                <w:rFonts w:ascii="Calibri" w:hAnsi="Calibri"/>
+                <w:color w:val="334155"/>
+                <w:sz w:val="19"/>
               </w:rPr>
+              <w:t>- app.py: Thiết kế màn hình Bước 2.5: Bảng Review &amp; Chỉnh sửa điểm trích xuất từ PDF (cho phép sinh viên kiểm tra, sửa điểm hoặc bổ sung môn trước khi đưa vào AI).</w:t>
             </w:r>
           </w:p>
           <w:p>
             <w:pPr>
-              <w:spacing w:before="20" w:after="20"/>
+              <w:spacing w:before="0" w:after="40" w:line="269" w:lineRule="auto"/>
             </w:pPr>
             <w:r>
               <w:rPr>
+                <w:rFonts w:ascii="Calibri" w:hAnsi="Calibri"/>
+                <w:color w:val="334155"/>
+                <w:sz w:val="19"/>
+              </w:rPr>
+              <w:t>- app.py: Lập trình hàm create_bar_chart(): Vẽ biểu đồ thanh ngang năng lực học tập bằng Plotly (go.Bar, thang màu Viridis tương tác).</w:t>
+            </w:r>
+          </w:p>
+          <w:p>
+            <w:pPr>
+              <w:spacing w:before="0" w:after="40" w:line="269" w:lineRule="auto"/>
+            </w:pPr>
+            <w:r>
+              <w:rPr>
+                <w:rFonts w:ascii="Calibri" w:hAnsi="Calibri"/>
+                <w:color w:val="334155"/>
+                <w:sz w:val="19"/>
+              </w:rPr>
+              <w:t>- app.py: Lập trình hàm generate_excel_report(): Kết xuất báo cáo kết quả DSS_Report.xlsx bằng thư viện openpyxl trực tiếp trên bộ nhớ đệm RAM (io.BytesIO) và gắn vào nút st.download_button().</w:t>
+            </w:r>
+          </w:p>
+          <w:p>
+            <w:pPr>
+              <w:spacing w:before="0" w:after="40" w:line="269" w:lineRule="auto"/>
+            </w:pPr>
+            <w:r>
+              <w:rPr>
+                <w:rFonts w:ascii="Calibri" w:hAnsi="Calibri"/>
+                <w:color w:val="334155"/>
+                <w:sz w:val="19"/>
+              </w:rPr>
+              <w:t>- app.py: Xây dựng hệ thống khảo sát đánh giá sao và lưu góp ý vào data/feedback.csv.</w:t>
+            </w:r>
+          </w:p>
+          <w:p>
+            <w:pPr>
+              <w:spacing w:before="0" w:after="40" w:line="269" w:lineRule="auto"/>
+            </w:pPr>
+            <w:r>
+              <w:rPr>
+                <w:rFonts w:ascii="Calibri" w:hAnsi="Calibri"/>
+                <w:color w:val="334155"/>
+                <w:sz w:val="19"/>
+              </w:rPr>
+              <w:t>- Quản lý danh mục thư viện trong requirements.txt và cập nhật tài liệu kỹ thuật README.md.</w:t>
+            </w:r>
+          </w:p>
+          <w:p>
+            <w:pPr>
+              <w:spacing w:before="0" w:after="40" w:line="269" w:lineRule="auto"/>
+            </w:pPr>
+          </w:p>
+          <w:p>
+            <w:pPr>
+              <w:spacing w:before="0" w:after="40" w:line="269" w:lineRule="auto"/>
+            </w:pPr>
+            <w:r>
+              <w:rPr>
+                <w:rFonts w:ascii="Calibri" w:hAnsi="Calibri"/>
                 <w:b/>
-                <w:i w:val="0"/>
+                <w:color w:val="0D9488"/>
                 <w:sz w:val="20"/>
               </w:rPr>
               <w:t>Báo cáo Word:</w:t>
@@ -952,74 +1328,81 @@
           </w:p>
           <w:p>
             <w:pPr>
-              <w:spacing w:before="20" w:after="20"/>
+              <w:spacing w:before="0" w:after="40" w:line="269" w:lineRule="auto"/>
             </w:pPr>
             <w:r>
               <w:rPr>
-                <w:b w:val="0"/>
-                <w:i w:val="0"/>
-                <w:sz w:val="20"/>
+                <w:rFonts w:ascii="Calibri" w:hAnsi="Calibri"/>
+                <w:color w:val="334155"/>
+                <w:sz w:val="19"/>
               </w:rPr>
-              <w:t>Chương 1: Tổng quan công nghệ (pandas, scikit-learn, Streamlit...).</w:t>
+              <w:t>- Phụ trách toàn bộ cuốn Sổ tay Hướng dẫn Sử dụng (01_Huong_Dan_Su_Dung.docx): Hướng dẫn cài đặt môi trường từ A đến Z, chụp ảnh màn hình minh họa giao diện từng bước (Step 1 -&gt; Step 2.5 -&gt; Step 3).</w:t>
             </w:r>
           </w:p>
           <w:p>
             <w:pPr>
-              <w:spacing w:before="20" w:after="20"/>
+              <w:spacing w:before="0" w:after="40" w:line="269" w:lineRule="auto"/>
             </w:pPr>
             <w:r>
               <w:rPr>
-                <w:b w:val="0"/>
-                <w:i w:val="0"/>
-                <w:sz w:val="20"/>
+                <w:rFonts w:ascii="Calibri" w:hAnsi="Calibri"/>
+                <w:color w:val="334155"/>
+                <w:sz w:val="19"/>
               </w:rPr>
-              <w:t>Chương 2: Sơ đồ luồng xử lý PDF (flowchart).</w:t>
+              <w:t>- Xây dựng Bảng tra cứu xử lý sự cố thường gặp (Troubleshooting) và mục Câu hỏi thường gặp (FAQ).</w:t>
             </w:r>
           </w:p>
           <w:p>
             <w:pPr>
-              <w:spacing w:before="20" w:after="20"/>
+              <w:spacing w:before="0" w:after="40" w:line="269" w:lineRule="auto"/>
+            </w:pPr>
+          </w:p>
+          <w:p>
+            <w:pPr>
+              <w:spacing w:before="0" w:after="40" w:line="269" w:lineRule="auto"/>
             </w:pPr>
             <w:r>
               <w:rPr>
-                <w:b w:val="0"/>
-                <w:i w:val="0"/>
+                <w:rFonts w:ascii="Calibri" w:hAnsi="Calibri"/>
+                <w:b/>
+                <w:color w:val="B45309"/>
                 <w:sz w:val="20"/>
               </w:rPr>
-              <w:t>Chương 3: Module pdf_extractor, giao diện web &amp; trực quan hóa.</w:t>
+              <w:t>Canva / Slide Thuyết trình:</w:t>
             </w:r>
           </w:p>
           <w:p>
             <w:pPr>
-              <w:spacing w:before="20" w:after="20"/>
+              <w:spacing w:before="0" w:after="40" w:line="269" w:lineRule="auto"/>
             </w:pPr>
             <w:r>
               <w:rPr>
-                <w:b w:val="0"/>
-                <w:i w:val="0"/>
-                <w:sz w:val="20"/>
+                <w:rFonts w:ascii="Calibri" w:hAnsi="Calibri"/>
+                <w:color w:val="334155"/>
+                <w:sz w:val="19"/>
               </w:rPr>
+              <w:t>- Trưởng ban Thiết kế Slide: Thiết kế toàn bộ slide thuyết trình Canva của nhóm, tạo hiệu ứng chuyển động mượt mà, chuyên nghiệp.</w:t>
             </w:r>
           </w:p>
           <w:p>
             <w:pPr>
-              <w:spacing w:before="20" w:after="20"/>
+              <w:spacing w:before="0" w:after="40" w:line="269" w:lineRule="auto"/>
             </w:pPr>
             <w:r>
               <w:rPr>
-                <w:b w:val="0"/>
-                <w:i w:val="0"/>
-                <w:sz w:val="20"/>
+                <w:rFonts w:ascii="Calibri" w:hAnsi="Calibri"/>
+                <w:color w:val="334155"/>
+                <w:sz w:val="19"/>
               </w:rPr>
-              <w:t>Canva: Slide công nghệ, slide demo giao diện, slide flow PDF.</w:t>
+              <w:t>- Chuẩn bị sẵn kịch bản và các file PDF bảng điểm mẫu để trực tiếp demo chạy ứng dụng web trước hội đồng chấm thi.</w:t>
             </w:r>
           </w:p>
         </w:tc>
       </w:tr>
     </w:tbl>
     <w:sectPr>
-      <w:pgSz w:w="11906" w:h="16838"/>
-      <w:pgMar w:top="1417" w:right="1134" w:bottom="1134" w:left="1134" w:header="720" w:footer="720" w:gutter="0"/>
+      <w:pgSz w:w="12240" w:h="15840"/>
+      <w:pgMar w:top="1152" w:right="1152" w:bottom="1152" w:left="1152" w:header="720" w:footer="720" w:gutter="0"/>
       <w:cols w:space="720"/>
       <w:docGrid w:linePitch="360"/>
     </w:sectPr>

</xml_diff>